<commit_message>
Formatos revisados INSP-01 a 10 y plantillas de INSP-06 a 10
Se copian al repositorio los 10 Word revisados (reemplazan los repetidos) y se
cargan como formulario INSP-06 a 10 (S/E móvil, transformador aéreo, switchgear sala
12, parrón de maniobra y sistema presurizado). INSP-04 y 05 se ajustan a los cambios
del Word (sin galería de fotos) y la norma pasa a Bbosch. El seed se renombra a
seed_plantillas_insp_01_10.sql. La bitácora viaja en este mismo commit.

Co-Authored-By: Claude Sonnet 5.5 <noreply@anthropic.com>
</commit_message>
<xml_diff>
--- a/docs/formatos/inspecciones/INSP-01 Desconectador Seccionador Maniobra 23 kV.docx
+++ b/docs/formatos/inspecciones/INSP-01 Desconectador Seccionador Maniobra 23 kV.docx
@@ -1340,23 +1340,7 @@
                 <w:rFonts w:ascii="Arial" w:hAnsi="Arial" w:cs="Arial"/>
                 <w:sz w:val="20"/>
               </w:rPr>
-              <w:t xml:space="preserve">Verificar estado aisladores pedestal </w:t>
-            </w:r>
-            <w:proofErr w:type="spellStart"/>
-            <w:r>
-              <w:rPr>
-                <w:rFonts w:ascii="Arial" w:hAnsi="Arial" w:cs="Arial"/>
-                <w:sz w:val="20"/>
-              </w:rPr>
-              <w:t>ó</w:t>
-            </w:r>
-            <w:proofErr w:type="spellEnd"/>
-            <w:r>
-              <w:rPr>
-                <w:rFonts w:ascii="Arial" w:hAnsi="Arial" w:cs="Arial"/>
-                <w:sz w:val="20"/>
-              </w:rPr>
-              <w:t xml:space="preserve"> espiga</w:t>
+              <w:t>Verificar estado aisladores pedestal ó espiga</w:t>
             </w:r>
           </w:p>
         </w:tc>
@@ -2395,44 +2379,6 @@
         <w:spacing w:line="360" w:lineRule="auto"/>
         <w:rPr>
           <w:sz w:val="20"/>
-        </w:rPr>
-      </w:pPr>
-    </w:p>
-    <w:p>
-      <w:pPr>
-        <w:spacing w:line="360" w:lineRule="auto"/>
-        <w:rPr>
-          <w:sz w:val="20"/>
-        </w:rPr>
-      </w:pPr>
-    </w:p>
-    <w:p>
-      <w:pPr>
-        <w:spacing w:line="360" w:lineRule="auto"/>
-        <w:rPr>
-          <w:sz w:val="20"/>
-        </w:rPr>
-      </w:pPr>
-    </w:p>
-    <w:p>
-      <w:pPr>
-        <w:spacing w:line="360" w:lineRule="auto"/>
-        <w:rPr>
-          <w:sz w:val="20"/>
-        </w:rPr>
-      </w:pPr>
-    </w:p>
-    <w:p>
-      <w:pPr>
-        <w:pStyle w:val="Textoindependiente"/>
-        <w:tabs>
-          <w:tab w:val="left" w:pos="360"/>
-        </w:tabs>
-        <w:spacing w:line="360" w:lineRule="auto"/>
-        <w:ind w:right="-81"/>
-        <w:rPr>
-          <w:rFonts w:ascii="Arial" w:hAnsi="Arial" w:cs="Arial"/>
-          <w:szCs w:val="20"/>
         </w:rPr>
       </w:pPr>
     </w:p>

</xml_diff>

<commit_message>
Firman solo el encargado, el supervisor y el planificador; firmantes Bbosch
Se elimina «Participantes» del cierre del formulario, del detalle y del informe: el
técnico firma como encargado de la actividad al enviar y el supervisor y el
planificador firman al revisar. En los Word se quita la fila de participantes y los
firmantes quedan siempre como «Supervisor Bbosch» y «Planificador Bbosch» (INSP-01 a
15 se copian de nuevo al repositorio). La bitácora viaja en este mismo commit.

Co-Authored-By: Claude Sonnet 5.5 <noreply@anthropic.com>
</commit_message>
<xml_diff>
--- a/docs/formatos/inspecciones/INSP-01 Desconectador Seccionador Maniobra 23 kV.docx
+++ b/docs/formatos/inspecciones/INSP-01 Desconectador Seccionador Maniobra 23 kV.docx
@@ -495,130 +495,6 @@
         </w:rPr>
       </w:pPr>
     </w:p>
-    <w:tbl>
-      <w:tblPr>
-        <w:tblW w:w="9284" w:type="dxa"/>
-        <w:tblBorders>
-          <w:top w:val="single" w:sz="4" w:space="0" w:color="auto"/>
-          <w:left w:val="single" w:sz="4" w:space="0" w:color="auto"/>
-          <w:bottom w:val="single" w:sz="4" w:space="0" w:color="auto"/>
-          <w:right w:val="single" w:sz="4" w:space="0" w:color="auto"/>
-          <w:insideH w:val="single" w:sz="4" w:space="0" w:color="auto"/>
-          <w:insideV w:val="single" w:sz="4" w:space="0" w:color="auto"/>
-        </w:tblBorders>
-        <w:tblCellMar>
-          <w:left w:w="70" w:type="dxa"/>
-          <w:right w:w="70" w:type="dxa"/>
-        </w:tblCellMar>
-        <w:tblLook w:val="04A0" w:firstRow="1" w:lastRow="0" w:firstColumn="1" w:lastColumn="0" w:noHBand="0" w:noVBand="1"/>
-      </w:tblPr>
-      <w:tblGrid>
-        <w:gridCol w:w="4890"/>
-        <w:gridCol w:w="4394"/>
-      </w:tblGrid>
-      <w:tr>
-        <w:trPr>
-          <w:trHeight w:val="300"/>
-        </w:trPr>
-        <w:tc>
-          <w:tcPr>
-            <w:tcW w:w="4890" w:type="dxa"/>
-            <w:noWrap/>
-            <w:vAlign w:val="center"/>
-            <w:hideMark/>
-          </w:tcPr>
-          <w:p>
-            <w:pPr>
-              <w:rPr>
-                <w:b/>
-                <w:bCs/>
-                <w:color w:val="000000"/>
-                <w:sz w:val="20"/>
-                <w:szCs w:val="20"/>
-              </w:rPr>
-            </w:pPr>
-            <w:r>
-              <w:rPr>
-                <w:b/>
-                <w:bCs/>
-                <w:color w:val="000000"/>
-                <w:sz w:val="20"/>
-              </w:rPr>
-              <w:t> </w:t>
-            </w:r>
-            <w:r>
-              <w:rPr>
-                <w:b/>
-                <w:bCs/>
-                <w:color w:val="000000"/>
-                <w:sz w:val="20"/>
-              </w:rPr>
-              <w:t>Participantes:</w:t>
-            </w:r>
-            <w:r>
-              <w:rPr>
-                <w:b/>
-                <w:bCs/>
-                <w:color w:val="000000"/>
-                <w:sz w:val="20"/>
-              </w:rPr>
-              <w:t xml:space="preserve"> </w:t>
-            </w:r>
-          </w:p>
-        </w:tc>
-        <w:tc>
-          <w:tcPr>
-            <w:tcW w:w="4394" w:type="dxa"/>
-            <w:noWrap/>
-            <w:vAlign w:val="center"/>
-            <w:hideMark/>
-          </w:tcPr>
-          <w:p>
-            <w:pPr>
-              <w:rPr>
-                <w:b/>
-                <w:bCs/>
-                <w:color w:val="000000"/>
-                <w:sz w:val="20"/>
-                <w:szCs w:val="20"/>
-              </w:rPr>
-            </w:pPr>
-            <w:r>
-              <w:rPr>
-                <w:b/>
-                <w:bCs/>
-                <w:color w:val="000000"/>
-                <w:sz w:val="20"/>
-              </w:rPr>
-              <w:t> </w:t>
-            </w:r>
-            <w:r>
-              <w:rPr>
-                <w:b/>
-                <w:bCs/>
-                <w:color w:val="000000"/>
-                <w:sz w:val="20"/>
-                <w:szCs w:val="20"/>
-              </w:rPr>
-              <w:t>Firma</w:t>
-            </w:r>
-            <w:r>
-              <w:rPr>
-                <w:b/>
-                <w:bCs/>
-                <w:color w:val="000000"/>
-                <w:sz w:val="20"/>
-                <w:szCs w:val="20"/>
-              </w:rPr>
-              <w:t>:</w:t>
-            </w:r>
-            <w:r>
-              <w:t xml:space="preserve"> </w:t>
-            </w:r>
-          </w:p>
-        </w:tc>
-      </w:tr>
-    </w:tbl>
     <w:p>
       <w:pPr>
         <w:rPr>

</xml_diff>

<commit_message>
Los participantes se siguen anotando, pero ya no firman
Se restituye el espacio de «Participantes» (opcional, texto libre, sin firma) en el
formulario, el detalle, el informe y los formatos Word (sin la celda de firma).
La única firma del técnico es la del encargado de la actividad. La bitácora viaja en
este mismo commit.

Co-Authored-By: Claude Sonnet 5.5 <noreply@anthropic.com>
</commit_message>
<xml_diff>
--- a/docs/formatos/inspecciones/INSP-01 Desconectador Seccionador Maniobra 23 kV.docx
+++ b/docs/formatos/inspecciones/INSP-01 Desconectador Seccionador Maniobra 23 kV.docx
@@ -495,6 +495,130 @@
         </w:rPr>
       </w:pPr>
     </w:p>
+    <w:tbl>
+      <w:tblPr>
+        <w:tblW w:w="9284" w:type="dxa"/>
+        <w:tblBorders>
+          <w:top w:val="single" w:sz="4" w:space="0" w:color="auto"/>
+          <w:left w:val="single" w:sz="4" w:space="0" w:color="auto"/>
+          <w:bottom w:val="single" w:sz="4" w:space="0" w:color="auto"/>
+          <w:right w:val="single" w:sz="4" w:space="0" w:color="auto"/>
+          <w:insideH w:val="single" w:sz="4" w:space="0" w:color="auto"/>
+          <w:insideV w:val="single" w:sz="4" w:space="0" w:color="auto"/>
+        </w:tblBorders>
+        <w:tblCellMar>
+          <w:left w:w="70" w:type="dxa"/>
+          <w:right w:w="70" w:type="dxa"/>
+        </w:tblCellMar>
+        <w:tblLook w:val="04A0" w:firstRow="1" w:lastRow="0" w:firstColumn="1" w:lastColumn="0" w:noHBand="0" w:noVBand="1"/>
+      </w:tblPr>
+      <w:tblGrid>
+        <w:gridCol w:w="4890"/>
+        <w:gridCol w:w="4394"/>
+      </w:tblGrid>
+      <w:tr>
+        <w:trPr>
+          <w:trHeight w:val="300"/>
+        </w:trPr>
+        <w:tc>
+          <w:tcPr>
+            <w:tcW w:w="4890" w:type="dxa"/>
+            <w:noWrap/>
+            <w:vAlign w:val="center"/>
+            <w:hideMark/>
+          </w:tcPr>
+          <w:p>
+            <w:pPr>
+              <w:rPr>
+                <w:b/>
+                <w:bCs/>
+                <w:color w:val="000000"/>
+                <w:sz w:val="20"/>
+                <w:szCs w:val="20"/>
+              </w:rPr>
+            </w:pPr>
+            <w:r>
+              <w:rPr>
+                <w:b/>
+                <w:bCs/>
+                <w:color w:val="000000"/>
+                <w:sz w:val="20"/>
+              </w:rPr>
+              <w:t> </w:t>
+            </w:r>
+            <w:r>
+              <w:rPr>
+                <w:b/>
+                <w:bCs/>
+                <w:color w:val="000000"/>
+                <w:sz w:val="20"/>
+              </w:rPr>
+              <w:t>Participantes:</w:t>
+            </w:r>
+            <w:r>
+              <w:rPr>
+                <w:b/>
+                <w:bCs/>
+                <w:color w:val="000000"/>
+                <w:sz w:val="20"/>
+              </w:rPr>
+              <w:t xml:space="preserve"> </w:t>
+            </w:r>
+          </w:p>
+        </w:tc>
+        <w:tc>
+          <w:tcPr>
+            <w:tcW w:w="4394" w:type="dxa"/>
+            <w:noWrap/>
+            <w:vAlign w:val="center"/>
+            <w:hideMark/>
+          </w:tcPr>
+          <w:p>
+            <w:pPr>
+              <w:rPr>
+                <w:b/>
+                <w:bCs/>
+                <w:color w:val="000000"/>
+                <w:sz w:val="20"/>
+                <w:szCs w:val="20"/>
+              </w:rPr>
+            </w:pPr>
+            <w:r>
+              <w:rPr>
+                <w:b/>
+                <w:bCs/>
+                <w:color w:val="000000"/>
+                <w:sz w:val="20"/>
+              </w:rPr>
+              <w:t/>
+            </w:r>
+            <w:r>
+              <w:rPr>
+                <w:b/>
+                <w:bCs/>
+                <w:color w:val="000000"/>
+                <w:sz w:val="20"/>
+                <w:szCs w:val="20"/>
+              </w:rPr>
+              <w:t/>
+            </w:r>
+            <w:r>
+              <w:rPr>
+                <w:b/>
+                <w:bCs/>
+                <w:color w:val="000000"/>
+                <w:sz w:val="20"/>
+                <w:szCs w:val="20"/>
+              </w:rPr>
+              <w:t/>
+            </w:r>
+            <w:r>
+              <w:t xml:space="preserve"/>
+            </w:r>
+          </w:p>
+        </w:tc>
+      </w:tr>
+    </w:tbl>
     <w:p>
       <w:pPr>
         <w:rPr>

</xml_diff>

<commit_message>
Mismo bloque de firmantes en todos los formatos Word
Participantes (sin firma), Encargado de la actividad, Supervisor Bbosch y
Planificador Bbosch, con las mismas etiquetas y en ese orden en los formatos. INSP-01 a
15 se copian de nuevo al repositorio. La bitácora viaja en este mismo commit.

Co-Authored-By: Claude Sonnet 5.5 <noreply@anthropic.com>
</commit_message>
<xml_diff>
--- a/docs/formatos/inspecciones/INSP-01 Desconectador Seccionador Maniobra 23 kV.docx
+++ b/docs/formatos/inspecciones/INSP-01 Desconectador Seccionador Maniobra 23 kV.docx
@@ -544,15 +544,6 @@
                 <w:color w:val="000000"/>
                 <w:sz w:val="20"/>
               </w:rPr>
-              <w:t> </w:t>
-            </w:r>
-            <w:r>
-              <w:rPr>
-                <w:b/>
-                <w:bCs/>
-                <w:color w:val="000000"/>
-                <w:sz w:val="20"/>
-              </w:rPr>
               <w:t>Participantes:</w:t>
             </w:r>
             <w:r>
@@ -562,7 +553,16 @@
                 <w:color w:val="000000"/>
                 <w:sz w:val="20"/>
               </w:rPr>
-              <w:t xml:space="preserve"> </w:t>
+              <w:t/>
+            </w:r>
+            <w:r>
+              <w:rPr>
+                <w:b/>
+                <w:bCs/>
+                <w:color w:val="000000"/>
+                <w:sz w:val="20"/>
+              </w:rPr>
+              <w:t xml:space="preserve"/>
             </w:r>
           </w:p>
         </w:tc>
@@ -682,16 +682,16 @@
                 <w:color w:val="000000"/>
                 <w:sz w:val="20"/>
               </w:rPr>
-              <w:t>Encargado de Actividad:</w:t>
-            </w:r>
-            <w:r>
-              <w:rPr>
-                <w:b/>
-                <w:bCs/>
-                <w:color w:val="000000"/>
-                <w:sz w:val="20"/>
-              </w:rPr>
-              <w:t xml:space="preserve"> </w:t>
+              <w:t>Encargado de la actividad:</w:t>
+            </w:r>
+            <w:r>
+              <w:rPr>
+                <w:b/>
+                <w:bCs/>
+                <w:color w:val="000000"/>
+                <w:sz w:val="20"/>
+              </w:rPr>
+              <w:t xml:space="preserve"/>
             </w:r>
           </w:p>
         </w:tc>
@@ -723,16 +723,16 @@
                 <w:color w:val="000000"/>
                 <w:sz w:val="20"/>
               </w:rPr>
-              <w:t>Firma</w:t>
-            </w:r>
-            <w:r>
-              <w:rPr>
-                <w:b/>
-                <w:bCs/>
-                <w:color w:val="000000"/>
-                <w:sz w:val="20"/>
-              </w:rPr>
-              <w:t>:</w:t>
+              <w:t>Firma:</w:t>
+            </w:r>
+            <w:r>
+              <w:rPr>
+                <w:b/>
+                <w:bCs/>
+                <w:color w:val="000000"/>
+                <w:sz w:val="20"/>
+              </w:rPr>
+              <w:t/>
             </w:r>
           </w:p>
         </w:tc>
@@ -772,7 +772,7 @@
                 <w:sz w:val="20"/>
                 <w:szCs w:val="20"/>
               </w:rPr>
-              <w:t xml:space="preserve">Supervisor </w:t>
+              <w:t xml:space="preserve">Supervisor Bbosch:</w:t>
             </w:r>
             <w:r>
               <w:rPr>
@@ -782,7 +782,7 @@
                 <w:sz w:val="20"/>
                 <w:szCs w:val="20"/>
               </w:rPr>
-              <w:t>Bbosch</w:t>
+              <w:t/>
             </w:r>
             <w:r>
               <w:rPr>
@@ -792,7 +792,7 @@
                 <w:sz w:val="20"/>
                 <w:szCs w:val="20"/>
               </w:rPr>
-              <w:t xml:space="preserve">: </w:t>
+              <w:t xml:space="preserve"/>
             </w:r>
           </w:p>
         </w:tc>
@@ -826,16 +826,16 @@
                 <w:color w:val="000000"/>
                 <w:sz w:val="20"/>
               </w:rPr>
-              <w:t>Firma Recepción:</w:t>
-            </w:r>
-            <w:r>
-              <w:rPr>
-                <w:b/>
-                <w:bCs/>
-                <w:color w:val="000000"/>
-                <w:sz w:val="20"/>
-              </w:rPr>
-              <w:t xml:space="preserve"> </w:t>
+              <w:t>Firma:</w:t>
+            </w:r>
+            <w:r>
+              <w:rPr>
+                <w:b/>
+                <w:bCs/>
+                <w:color w:val="000000"/>
+                <w:sz w:val="20"/>
+              </w:rPr>
+              <w:t xml:space="preserve"/>
             </w:r>
           </w:p>
         </w:tc>
@@ -875,7 +875,7 @@
                 <w:sz w:val="20"/>
                 <w:szCs w:val="20"/>
               </w:rPr>
-              <w:t xml:space="preserve">Planificador </w:t>
+              <w:t xml:space="preserve">Planificador Bbosch:</w:t>
             </w:r>
             <w:r>
               <w:rPr>
@@ -885,7 +885,7 @@
                 <w:sz w:val="20"/>
                 <w:szCs w:val="20"/>
               </w:rPr>
-              <w:t>Bbosch</w:t>
+              <w:t/>
             </w:r>
             <w:r>
               <w:rPr>
@@ -895,7 +895,7 @@
                 <w:sz w:val="20"/>
                 <w:szCs w:val="20"/>
               </w:rPr>
-              <w:t>:</w:t>
+              <w:t/>
             </w:r>
             <w:r>
               <w:rPr>
@@ -905,7 +905,7 @@
                 <w:sz w:val="20"/>
                 <w:szCs w:val="20"/>
               </w:rPr>
-              <w:t xml:space="preserve"> </w:t>
+              <w:t xml:space="preserve"/>
             </w:r>
           </w:p>
         </w:tc>
@@ -939,16 +939,16 @@
                 <w:color w:val="000000"/>
                 <w:sz w:val="20"/>
               </w:rPr>
-              <w:t>Firma Recepción:</w:t>
-            </w:r>
-            <w:r>
-              <w:rPr>
-                <w:b/>
-                <w:bCs/>
-                <w:color w:val="000000"/>
-                <w:sz w:val="20"/>
-              </w:rPr>
-              <w:t xml:space="preserve"> </w:t>
+              <w:t>Firma:</w:t>
+            </w:r>
+            <w:r>
+              <w:rPr>
+                <w:b/>
+                <w:bCs/>
+                <w:color w:val="000000"/>
+                <w:sz w:val="20"/>
+              </w:rPr>
+              <w:t xml:space="preserve"/>
             </w:r>
           </w:p>
         </w:tc>

</xml_diff>